<commit_message>
improved photo gallery css
</commit_message>
<xml_diff>
--- a/Documents/Part 1 improvements.docx
+++ b/Documents/Part 1 improvements.docx
@@ -652,6 +652,22 @@
       </w:r>
       <w:r>
         <w:t xml:space="preserve"> Every page you create from now on (Home, About Us, Directory) can link to this exact same style.css file, ensuring perfect design harmony across your entire system.</w:t>
+      </w:r>
+    </w:p>
+    <w:p>
+      <w:pPr>
+        <w:ind w:left="360"/>
+      </w:pPr>
+      <w:proofErr w:type="spellStart"/>
+      <w:r>
+        <w:t>Github</w:t>
+      </w:r>
+      <w:proofErr w:type="spellEnd"/>
+      <w:r>
+        <w:t xml:space="preserve"> link </w:t>
+      </w:r>
+      <w:r>
+        <w:t>https://github.com/lisasibongilengwenya06-lang/Zionist-church.git</w:t>
       </w:r>
     </w:p>
     <w:p/>
@@ -1879,6 +1895,7 @@
   <w:style w:type="character" w:default="1" w:styleId="DefaultParagraphFont">
     <w:name w:val="Default Paragraph Font"/>
     <w:uiPriority w:val="1"/>
+    <w:semiHidden/>
     <w:unhideWhenUsed/>
   </w:style>
   <w:style w:type="table" w:default="1" w:styleId="TableNormal">

</xml_diff>